<commit_message>
Actualización automática en Raíces Vivas – 2026-04-20 11:29:04 Host: Cambios: 3 archivos modificados — M .obsidian/community-plugins.json 08-Recursos/PDFs/01-Formato Entrega Final.docx, D 08-Recursos/PDFs/.~lock.01-Formato Entrega Final.docx#
Affected files:
.obsidian/community-plugins.json
08-Recursos/PDFs/.~lock.01-Formato Entrega Final.docx#
08-Recursos/PDFs/01-Formato Entrega Final.docx
</commit_message>
<xml_diff>
--- a/08-Recursos/PDFs/01-Formato Entrega Final.docx
+++ b/08-Recursos/PDFs/01-Formato Entrega Final.docx
@@ -437,31 +437,12 @@
       <w:sdtContent>
         <w:p>
           <w:pPr>
-            <w:pStyle w:val="normal1"/>
-            <w:widowControl w:val="false"/>
+            <w:pStyle w:val="TOC1"/>
             <w:tabs>
-              <w:tab w:val="clear" w:pos="720"/>
-              <w:tab w:val="right" w:pos="12000" w:leader="dot"/>
+              <w:tab w:val="clear" w:pos="9026"/>
+              <w:tab w:val="right" w:pos="9025" w:leader="dot"/>
             </w:tabs>
-            <w:spacing w:lineRule="auto" w:line="240" w:before="60" w:after="0"/>
-            <w:rPr>
-              <w:rFonts w:ascii="Arial" w:hAnsi="Arial" w:eastAsia="Arial" w:cs="Arial"/>
-              <w:b/>
-              <w:bCs/>
-              <w:i w:val="false"/>
-              <w:iCs w:val="false"/>
-              <w:caps w:val="false"/>
-              <w:smallCaps w:val="false"/>
-              <w:strike w:val="false"/>
-              <w:dstrike w:val="false"/>
-              <w:color w:val="000000"/>
-              <w:position w:val="0"/>
-              <w:sz w:val="22"/>
-              <w:szCs w:val="22"/>
-              <w:u w:val="none"/>
-              <w:shd w:fill="auto" w:val="clear"/>
-              <w:vertAlign w:val="baseline"/>
-            </w:rPr>
+            <w:rPr/>
           </w:pPr>
           <w:r>
             <w:fldChar w:fldCharType="begin"/>
@@ -469,70 +450,19 @@
           <w:r>
             <w:rPr>
               <w:rStyle w:val="IndexLink"/>
-              <w:rFonts w:eastAsia="Arial" w:cs="Arial"/>
-              <w:b/>
-              <w:bCs/>
-              <w:i w:val="false"/>
-              <w:iCs w:val="false"/>
-              <w:caps w:val="false"/>
-              <w:smallCaps w:val="false"/>
-              <w:strike w:val="false"/>
-              <w:dstrike w:val="false"/>
-              <w:webHidden/>
-              <w:color w:val="000000"/>
-              <w:position w:val="0"/>
-              <w:sz w:val="22"/>
-              <w:szCs w:val="22"/>
-              <w:u w:val="none"/>
-              <w:shd w:fill="auto" w:val="clear"/>
-              <w:vertAlign w:val="baseline"/>
             </w:rPr>
-            <w:instrText xml:space="preserve"> TOC \z \o "1-9" \u \t "heading 1,1,heading 2,2" \h</w:instrText>
+            <w:instrText xml:space="preserve"> TOC \f \o "1-9" \t "heading 1,1,heading 2,2" \h</w:instrText>
           </w:r>
           <w:r>
             <w:rPr>
               <w:rStyle w:val="IndexLink"/>
-              <w:rFonts w:eastAsia="Arial" w:cs="Arial"/>
-              <w:b/>
-              <w:bCs/>
-              <w:i w:val="false"/>
-              <w:iCs w:val="false"/>
-              <w:caps w:val="false"/>
-              <w:smallCaps w:val="false"/>
-              <w:strike w:val="false"/>
-              <w:dstrike w:val="false"/>
-              <w:webHidden/>
-              <w:color w:val="000000"/>
-              <w:position w:val="0"/>
-              <w:sz w:val="22"/>
-              <w:szCs w:val="22"/>
-              <w:u w:val="none"/>
-              <w:shd w:fill="auto" w:val="clear"/>
-              <w:vertAlign w:val="baseline"/>
             </w:rPr>
             <w:fldChar w:fldCharType="separate"/>
           </w:r>
-          <w:hyperlink w:anchor="_heading=h.624hrs1h4ct3">
+          <w:hyperlink w:anchor="__RefHeading___Toc548_4166569315" w:tooltip="Capítulo 1 Análisis del Problema">
             <w:r>
               <w:rPr>
                 <w:rStyle w:val="IndexLink"/>
-                <w:rFonts w:eastAsia="Arial" w:cs="Arial"/>
-                <w:b/>
-                <w:bCs/>
-                <w:i w:val="false"/>
-                <w:iCs w:val="false"/>
-                <w:caps w:val="false"/>
-                <w:smallCaps w:val="false"/>
-                <w:strike w:val="false"/>
-                <w:dstrike w:val="false"/>
-                <w:webHidden/>
-                <w:color w:val="000000"/>
-                <w:position w:val="0"/>
-                <w:sz w:val="22"/>
-                <w:szCs w:val="22"/>
-                <w:u w:val="none"/>
-                <w:shd w:fill="auto" w:val="clear"/>
-                <w:vertAlign w:val="baseline"/>
               </w:rPr>
               <w:t>Capítulo 1 Análisis del Problema</w:t>
               <w:tab/>
@@ -542,54 +472,17 @@
         </w:p>
         <w:p>
           <w:pPr>
-            <w:pStyle w:val="normal1"/>
-            <w:widowControl w:val="false"/>
+            <w:pStyle w:val="TOC2"/>
             <w:tabs>
-              <w:tab w:val="clear" w:pos="720"/>
-              <w:tab w:val="right" w:pos="12000" w:leader="dot"/>
+              <w:tab w:val="clear" w:pos="8743"/>
+              <w:tab w:val="right" w:pos="9025" w:leader="dot"/>
             </w:tabs>
-            <w:spacing w:lineRule="auto" w:line="240" w:before="60" w:after="0"/>
-            <w:ind w:hanging="0" w:start="360"/>
-            <w:rPr>
-              <w:rFonts w:ascii="Arial" w:hAnsi="Arial" w:eastAsia="Arial" w:cs="Arial"/>
-              <w:b w:val="false"/>
-              <w:bCs w:val="false"/>
-              <w:i w:val="false"/>
-              <w:iCs w:val="false"/>
-              <w:caps w:val="false"/>
-              <w:smallCaps w:val="false"/>
-              <w:strike w:val="false"/>
-              <w:dstrike w:val="false"/>
-              <w:color w:val="000000"/>
-              <w:position w:val="0"/>
-              <w:sz w:val="22"/>
-              <w:szCs w:val="22"/>
-              <w:u w:val="none"/>
-              <w:shd w:fill="auto" w:val="clear"/>
-              <w:vertAlign w:val="baseline"/>
-            </w:rPr>
+            <w:rPr/>
           </w:pPr>
-          <w:hyperlink w:anchor="_heading=h.lehb982uduij">
+          <w:hyperlink w:anchor="__RefHeading___Toc558_4166569315" w:tooltip="Descripción del problema">
             <w:r>
               <w:rPr>
                 <w:rStyle w:val="IndexLink"/>
-                <w:rFonts w:eastAsia="Arial" w:cs="Arial"/>
-                <w:b/>
-                <w:bCs/>
-                <w:i w:val="false"/>
-                <w:iCs w:val="false"/>
-                <w:caps w:val="false"/>
-                <w:smallCaps w:val="false"/>
-                <w:strike w:val="false"/>
-                <w:dstrike w:val="false"/>
-                <w:webHidden/>
-                <w:color w:val="000000"/>
-                <w:position w:val="0"/>
-                <w:sz w:val="22"/>
-                <w:szCs w:val="22"/>
-                <w:u w:val="none"/>
-                <w:shd w:fill="auto" w:val="clear"/>
-                <w:vertAlign w:val="baseline"/>
               </w:rPr>
               <w:t>Descripción del problema</w:t>
               <w:tab/>
@@ -599,54 +492,17 @@
         </w:p>
         <w:p>
           <w:pPr>
-            <w:pStyle w:val="normal1"/>
-            <w:widowControl w:val="false"/>
+            <w:pStyle w:val="TOC2"/>
             <w:tabs>
-              <w:tab w:val="clear" w:pos="720"/>
-              <w:tab w:val="right" w:pos="12000" w:leader="dot"/>
+              <w:tab w:val="clear" w:pos="8743"/>
+              <w:tab w:val="right" w:pos="9025" w:leader="dot"/>
             </w:tabs>
-            <w:spacing w:lineRule="auto" w:line="240" w:before="60" w:after="0"/>
-            <w:ind w:hanging="0" w:start="360"/>
-            <w:rPr>
-              <w:rFonts w:ascii="Arial" w:hAnsi="Arial" w:eastAsia="Arial" w:cs="Arial"/>
-              <w:b w:val="false"/>
-              <w:bCs w:val="false"/>
-              <w:i w:val="false"/>
-              <w:iCs w:val="false"/>
-              <w:caps w:val="false"/>
-              <w:smallCaps w:val="false"/>
-              <w:strike w:val="false"/>
-              <w:dstrike w:val="false"/>
-              <w:color w:val="000000"/>
-              <w:position w:val="0"/>
-              <w:sz w:val="22"/>
-              <w:szCs w:val="22"/>
-              <w:u w:val="none"/>
-              <w:shd w:fill="auto" w:val="clear"/>
-              <w:vertAlign w:val="baseline"/>
-            </w:rPr>
+            <w:rPr/>
           </w:pPr>
-          <w:hyperlink w:anchor="_heading=h.xkq3qn30dt6p">
+          <w:hyperlink w:anchor="__RefHeading___Toc572_4166569315" w:tooltip="Modelado">
             <w:r>
               <w:rPr>
                 <w:rStyle w:val="IndexLink"/>
-                <w:rFonts w:eastAsia="Arial" w:cs="Arial"/>
-                <w:b w:val="false"/>
-                <w:bCs w:val="false"/>
-                <w:i w:val="false"/>
-                <w:iCs w:val="false"/>
-                <w:caps w:val="false"/>
-                <w:smallCaps w:val="false"/>
-                <w:strike w:val="false"/>
-                <w:dstrike w:val="false"/>
-                <w:webHidden/>
-                <w:color w:val="000000"/>
-                <w:position w:val="0"/>
-                <w:sz w:val="22"/>
-                <w:szCs w:val="22"/>
-                <w:u w:val="none"/>
-                <w:shd w:fill="auto" w:val="clear"/>
-                <w:vertAlign w:val="baseline"/>
               </w:rPr>
               <w:t>Modelado</w:t>
               <w:tab/>
@@ -656,53 +512,17 @@
         </w:p>
         <w:p>
           <w:pPr>
-            <w:pStyle w:val="normal1"/>
-            <w:widowControl w:val="false"/>
+            <w:pStyle w:val="TOC1"/>
             <w:tabs>
-              <w:tab w:val="clear" w:pos="720"/>
-              <w:tab w:val="right" w:pos="12000" w:leader="dot"/>
+              <w:tab w:val="clear" w:pos="9026"/>
+              <w:tab w:val="right" w:pos="9025" w:leader="dot"/>
             </w:tabs>
-            <w:spacing w:lineRule="auto" w:line="240" w:before="60" w:after="0"/>
-            <w:rPr>
-              <w:rFonts w:ascii="Arial" w:hAnsi="Arial" w:eastAsia="Arial" w:cs="Arial"/>
-              <w:b/>
-              <w:bCs/>
-              <w:i w:val="false"/>
-              <w:iCs w:val="false"/>
-              <w:caps w:val="false"/>
-              <w:smallCaps w:val="false"/>
-              <w:strike w:val="false"/>
-              <w:dstrike w:val="false"/>
-              <w:color w:val="000000"/>
-              <w:position w:val="0"/>
-              <w:sz w:val="22"/>
-              <w:szCs w:val="22"/>
-              <w:u w:val="none"/>
-              <w:shd w:fill="auto" w:val="clear"/>
-              <w:vertAlign w:val="baseline"/>
-            </w:rPr>
+            <w:rPr/>
           </w:pPr>
-          <w:hyperlink w:anchor="_heading=h.y47pa64web59">
+          <w:hyperlink w:anchor="__RefHeading___Toc556_4166569315" w:tooltip="Capítulo 2 Diseño de la Solución">
             <w:r>
               <w:rPr>
                 <w:rStyle w:val="IndexLink"/>
-                <w:rFonts w:eastAsia="Arial" w:cs="Arial"/>
-                <w:b/>
-                <w:bCs/>
-                <w:i w:val="false"/>
-                <w:iCs w:val="false"/>
-                <w:caps w:val="false"/>
-                <w:smallCaps w:val="false"/>
-                <w:strike w:val="false"/>
-                <w:dstrike w:val="false"/>
-                <w:webHidden/>
-                <w:color w:val="000000"/>
-                <w:position w:val="0"/>
-                <w:sz w:val="22"/>
-                <w:szCs w:val="22"/>
-                <w:u w:val="none"/>
-                <w:shd w:fill="auto" w:val="clear"/>
-                <w:vertAlign w:val="baseline"/>
               </w:rPr>
               <w:t>Capítulo 2 Diseño de la Solución</w:t>
               <w:tab/>
@@ -712,54 +532,17 @@
         </w:p>
         <w:p>
           <w:pPr>
-            <w:pStyle w:val="normal1"/>
-            <w:widowControl w:val="false"/>
+            <w:pStyle w:val="TOC2"/>
             <w:tabs>
-              <w:tab w:val="clear" w:pos="720"/>
-              <w:tab w:val="right" w:pos="12000" w:leader="dot"/>
+              <w:tab w:val="clear" w:pos="8743"/>
+              <w:tab w:val="right" w:pos="9025" w:leader="dot"/>
             </w:tabs>
-            <w:spacing w:lineRule="auto" w:line="240" w:before="60" w:after="0"/>
-            <w:ind w:hanging="0" w:start="360"/>
-            <w:rPr>
-              <w:rFonts w:ascii="Arial" w:hAnsi="Arial" w:eastAsia="Arial" w:cs="Arial"/>
-              <w:b w:val="false"/>
-              <w:bCs w:val="false"/>
-              <w:i w:val="false"/>
-              <w:iCs w:val="false"/>
-              <w:caps w:val="false"/>
-              <w:smallCaps w:val="false"/>
-              <w:strike w:val="false"/>
-              <w:dstrike w:val="false"/>
-              <w:color w:val="000000"/>
-              <w:position w:val="0"/>
-              <w:sz w:val="22"/>
-              <w:szCs w:val="22"/>
-              <w:u w:val="none"/>
-              <w:shd w:fill="auto" w:val="clear"/>
-              <w:vertAlign w:val="baseline"/>
-            </w:rPr>
+            <w:rPr/>
           </w:pPr>
-          <w:hyperlink w:anchor="_heading=h.xuoeeww0ejuk">
+          <w:hyperlink w:anchor="__RefHeading___Toc570_4166569315" w:tooltip="Descripción de la solución">
             <w:r>
               <w:rPr>
                 <w:rStyle w:val="IndexLink"/>
-                <w:rFonts w:eastAsia="Arial" w:cs="Arial"/>
-                <w:b w:val="false"/>
-                <w:bCs w:val="false"/>
-                <w:i w:val="false"/>
-                <w:iCs w:val="false"/>
-                <w:caps w:val="false"/>
-                <w:smallCaps w:val="false"/>
-                <w:strike w:val="false"/>
-                <w:dstrike w:val="false"/>
-                <w:webHidden/>
-                <w:color w:val="000000"/>
-                <w:position w:val="0"/>
-                <w:sz w:val="22"/>
-                <w:szCs w:val="22"/>
-                <w:u w:val="none"/>
-                <w:shd w:fill="auto" w:val="clear"/>
-                <w:vertAlign w:val="baseline"/>
               </w:rPr>
               <w:t>Descripción de la solución</w:t>
               <w:tab/>
@@ -769,54 +552,17 @@
         </w:p>
         <w:p>
           <w:pPr>
-            <w:pStyle w:val="normal1"/>
-            <w:widowControl w:val="false"/>
+            <w:pStyle w:val="TOC2"/>
             <w:tabs>
-              <w:tab w:val="clear" w:pos="720"/>
-              <w:tab w:val="right" w:pos="12000" w:leader="dot"/>
+              <w:tab w:val="clear" w:pos="8743"/>
+              <w:tab w:val="right" w:pos="9025" w:leader="dot"/>
             </w:tabs>
-            <w:spacing w:lineRule="auto" w:line="240" w:before="60" w:after="0"/>
-            <w:ind w:hanging="0" w:start="360"/>
-            <w:rPr>
-              <w:rFonts w:ascii="Arial" w:hAnsi="Arial" w:eastAsia="Arial" w:cs="Arial"/>
-              <w:b w:val="false"/>
-              <w:bCs w:val="false"/>
-              <w:i w:val="false"/>
-              <w:iCs w:val="false"/>
-              <w:caps w:val="false"/>
-              <w:smallCaps w:val="false"/>
-              <w:strike w:val="false"/>
-              <w:dstrike w:val="false"/>
-              <w:color w:val="000000"/>
-              <w:position w:val="0"/>
-              <w:sz w:val="22"/>
-              <w:szCs w:val="22"/>
-              <w:u w:val="none"/>
-              <w:shd w:fill="auto" w:val="clear"/>
-              <w:vertAlign w:val="baseline"/>
-            </w:rPr>
+            <w:rPr/>
           </w:pPr>
-          <w:hyperlink w:anchor="_heading=h.5zvd6ce41c5g">
+          <w:hyperlink w:anchor="__RefHeading___Toc568_4166569315" w:tooltip="Prototipos">
             <w:r>
               <w:rPr>
                 <w:rStyle w:val="IndexLink"/>
-                <w:rFonts w:eastAsia="Arial" w:cs="Arial"/>
-                <w:b w:val="false"/>
-                <w:bCs w:val="false"/>
-                <w:i w:val="false"/>
-                <w:iCs w:val="false"/>
-                <w:caps w:val="false"/>
-                <w:smallCaps w:val="false"/>
-                <w:strike w:val="false"/>
-                <w:dstrike w:val="false"/>
-                <w:webHidden/>
-                <w:color w:val="000000"/>
-                <w:position w:val="0"/>
-                <w:sz w:val="22"/>
-                <w:szCs w:val="22"/>
-                <w:u w:val="none"/>
-                <w:shd w:fill="auto" w:val="clear"/>
-                <w:vertAlign w:val="baseline"/>
               </w:rPr>
               <w:t>Prototipos</w:t>
               <w:tab/>
@@ -826,110 +572,37 @@
         </w:p>
         <w:p>
           <w:pPr>
-            <w:pStyle w:val="normal1"/>
-            <w:widowControl w:val="false"/>
+            <w:pStyle w:val="TOC1"/>
             <w:tabs>
-              <w:tab w:val="clear" w:pos="720"/>
-              <w:tab w:val="right" w:pos="12000" w:leader="dot"/>
+              <w:tab w:val="clear" w:pos="9026"/>
+              <w:tab w:val="right" w:pos="9025" w:leader="dot"/>
             </w:tabs>
-            <w:spacing w:lineRule="auto" w:line="240" w:before="60" w:after="0"/>
-            <w:rPr>
-              <w:rFonts w:ascii="Arial" w:hAnsi="Arial" w:eastAsia="Arial" w:cs="Arial"/>
-              <w:b/>
-              <w:bCs/>
-              <w:i w:val="false"/>
-              <w:iCs w:val="false"/>
-              <w:caps w:val="false"/>
-              <w:smallCaps w:val="false"/>
-              <w:strike w:val="false"/>
-              <w:dstrike w:val="false"/>
-              <w:color w:val="000000"/>
-              <w:position w:val="0"/>
-              <w:sz w:val="22"/>
-              <w:szCs w:val="22"/>
-              <w:u w:val="none"/>
-              <w:shd w:fill="auto" w:val="clear"/>
-              <w:vertAlign w:val="baseline"/>
-            </w:rPr>
+            <w:rPr/>
           </w:pPr>
-          <w:hyperlink w:anchor="_heading=h.ok6b3wy6o8k8">
+          <w:hyperlink w:anchor="__RefHeading___Toc554_4166569315" w:tooltip="Capítulo 3 Gestión de Proyecto">
             <w:r>
               <w:rPr>
                 <w:rStyle w:val="IndexLink"/>
-                <w:rFonts w:eastAsia="Arial" w:cs="Arial"/>
-                <w:b/>
-                <w:bCs/>
-                <w:i w:val="false"/>
-                <w:iCs w:val="false"/>
-                <w:caps w:val="false"/>
-                <w:smallCaps w:val="false"/>
-                <w:strike w:val="false"/>
-                <w:dstrike w:val="false"/>
-                <w:webHidden/>
-                <w:color w:val="000000"/>
-                <w:position w:val="0"/>
-                <w:sz w:val="22"/>
-                <w:szCs w:val="22"/>
-                <w:u w:val="none"/>
-                <w:shd w:fill="auto" w:val="clear"/>
-                <w:vertAlign w:val="baseline"/>
               </w:rPr>
               <w:t>Capítulo 3 Gestión de Proyecto</w:t>
               <w:tab/>
-              <w:t>5</w:t>
+              <w:t>6</w:t>
             </w:r>
           </w:hyperlink>
         </w:p>
         <w:p>
           <w:pPr>
-            <w:pStyle w:val="normal1"/>
-            <w:widowControl w:val="false"/>
+            <w:pStyle w:val="TOC2"/>
             <w:tabs>
-              <w:tab w:val="clear" w:pos="720"/>
-              <w:tab w:val="right" w:pos="12000" w:leader="dot"/>
+              <w:tab w:val="clear" w:pos="8743"/>
+              <w:tab w:val="right" w:pos="9025" w:leader="dot"/>
             </w:tabs>
-            <w:spacing w:lineRule="auto" w:line="240" w:before="60" w:after="0"/>
-            <w:ind w:hanging="0" w:start="360"/>
-            <w:rPr>
-              <w:rFonts w:ascii="Arial" w:hAnsi="Arial" w:eastAsia="Arial" w:cs="Arial"/>
-              <w:b w:val="false"/>
-              <w:bCs w:val="false"/>
-              <w:i w:val="false"/>
-              <w:iCs w:val="false"/>
-              <w:caps w:val="false"/>
-              <w:smallCaps w:val="false"/>
-              <w:strike w:val="false"/>
-              <w:dstrike w:val="false"/>
-              <w:color w:val="000000"/>
-              <w:position w:val="0"/>
-              <w:sz w:val="22"/>
-              <w:szCs w:val="22"/>
-              <w:u w:val="none"/>
-              <w:shd w:fill="auto" w:val="clear"/>
-              <w:vertAlign w:val="baseline"/>
-            </w:rPr>
+            <w:rPr/>
           </w:pPr>
-          <w:hyperlink w:anchor="_heading=h.8tnt7c5za8ar">
+          <w:hyperlink w:anchor="__RefHeading___Toc566_4166569315" w:tooltip="Gestión de requisitos">
             <w:r>
               <w:rPr>
                 <w:rStyle w:val="IndexLink"/>
-                <w:rFonts w:eastAsia="Arial" w:cs="Arial"/>
-                <w:b w:val="false"/>
-                <w:bCs w:val="false"/>
-                <w:i w:val="false"/>
-                <w:iCs w:val="false"/>
-                <w:caps w:val="false"/>
-                <w:smallCaps w:val="false"/>
-                <w:strike w:val="false"/>
-                <w:dstrike w:val="false"/>
-                <w:webHidden/>
-                <w:color w:val="000000"/>
-                <w:position w:val="0"/>
-                <w:sz w:val="22"/>
-                <w:szCs w:val="22"/>
-                <w:u w:val="none"/>
-                <w:shd w:fill="auto" w:val="clear"/>
-                <w:vertAlign w:val="baseline"/>
               </w:rPr>
               <w:t>Gestión de requisitos</w:t>
               <w:tab/>
@@ -939,54 +612,17 @@
         </w:p>
         <w:p>
           <w:pPr>
-            <w:pStyle w:val="normal1"/>
-            <w:widowControl w:val="false"/>
+            <w:pStyle w:val="TOC2"/>
             <w:tabs>
-              <w:tab w:val="clear" w:pos="720"/>
-              <w:tab w:val="right" w:pos="12000" w:leader="dot"/>
+              <w:tab w:val="clear" w:pos="8743"/>
+              <w:tab w:val="right" w:pos="9025" w:leader="dot"/>
             </w:tabs>
-            <w:spacing w:lineRule="auto" w:line="240" w:before="60" w:after="0"/>
-            <w:ind w:hanging="0" w:start="360"/>
-            <w:rPr>
-              <w:rFonts w:ascii="Arial" w:hAnsi="Arial" w:eastAsia="Arial" w:cs="Arial"/>
-              <w:b w:val="false"/>
-              <w:bCs w:val="false"/>
-              <w:i w:val="false"/>
-              <w:iCs w:val="false"/>
-              <w:caps w:val="false"/>
-              <w:smallCaps w:val="false"/>
-              <w:strike w:val="false"/>
-              <w:dstrike w:val="false"/>
-              <w:color w:val="000000"/>
-              <w:position w:val="0"/>
-              <w:sz w:val="22"/>
-              <w:szCs w:val="22"/>
-              <w:u w:val="none"/>
-              <w:shd w:fill="auto" w:val="clear"/>
-              <w:vertAlign w:val="baseline"/>
-            </w:rPr>
+            <w:rPr/>
           </w:pPr>
-          <w:hyperlink w:anchor="_heading=h.t3o68wmncyut">
+          <w:hyperlink w:anchor="__RefHeading___Toc564_4166569315" w:tooltip="Estimación de requisitos">
             <w:r>
               <w:rPr>
                 <w:rStyle w:val="IndexLink"/>
-                <w:rFonts w:eastAsia="Arial" w:cs="Arial"/>
-                <w:b w:val="false"/>
-                <w:bCs w:val="false"/>
-                <w:i w:val="false"/>
-                <w:iCs w:val="false"/>
-                <w:caps w:val="false"/>
-                <w:smallCaps w:val="false"/>
-                <w:strike w:val="false"/>
-                <w:dstrike w:val="false"/>
-                <w:webHidden/>
-                <w:color w:val="000000"/>
-                <w:position w:val="0"/>
-                <w:sz w:val="22"/>
-                <w:szCs w:val="22"/>
-                <w:u w:val="none"/>
-                <w:shd w:fill="auto" w:val="clear"/>
-                <w:vertAlign w:val="baseline"/>
               </w:rPr>
               <w:t>Estimación de requisitos</w:t>
               <w:tab/>
@@ -996,54 +632,17 @@
         </w:p>
         <w:p>
           <w:pPr>
-            <w:pStyle w:val="normal1"/>
-            <w:widowControl w:val="false"/>
+            <w:pStyle w:val="TOC2"/>
             <w:tabs>
-              <w:tab w:val="clear" w:pos="720"/>
-              <w:tab w:val="right" w:pos="12000" w:leader="dot"/>
+              <w:tab w:val="clear" w:pos="8743"/>
+              <w:tab w:val="right" w:pos="9025" w:leader="dot"/>
             </w:tabs>
-            <w:spacing w:lineRule="auto" w:line="240" w:before="60" w:after="0"/>
-            <w:ind w:hanging="0" w:start="360"/>
-            <w:rPr>
-              <w:rFonts w:ascii="Arial" w:hAnsi="Arial" w:eastAsia="Arial" w:cs="Arial"/>
-              <w:b w:val="false"/>
-              <w:bCs w:val="false"/>
-              <w:i w:val="false"/>
-              <w:iCs w:val="false"/>
-              <w:caps w:val="false"/>
-              <w:smallCaps w:val="false"/>
-              <w:strike w:val="false"/>
-              <w:dstrike w:val="false"/>
-              <w:color w:val="000000"/>
-              <w:position w:val="0"/>
-              <w:sz w:val="22"/>
-              <w:szCs w:val="22"/>
-              <w:u w:val="none"/>
-              <w:shd w:fill="auto" w:val="clear"/>
-              <w:vertAlign w:val="baseline"/>
-            </w:rPr>
+            <w:rPr/>
           </w:pPr>
-          <w:hyperlink w:anchor="_heading=h.gokhxcei9oq">
+          <w:hyperlink w:anchor="__RefHeading___Toc562_4166569315" w:tooltip="Desglose funcional del trabajo">
             <w:r>
               <w:rPr>
                 <w:rStyle w:val="IndexLink"/>
-                <w:rFonts w:eastAsia="Arial" w:cs="Arial"/>
-                <w:b w:val="false"/>
-                <w:bCs w:val="false"/>
-                <w:i w:val="false"/>
-                <w:iCs w:val="false"/>
-                <w:caps w:val="false"/>
-                <w:smallCaps w:val="false"/>
-                <w:strike w:val="false"/>
-                <w:dstrike w:val="false"/>
-                <w:webHidden/>
-                <w:color w:val="000000"/>
-                <w:position w:val="0"/>
-                <w:sz w:val="22"/>
-                <w:szCs w:val="22"/>
-                <w:u w:val="none"/>
-                <w:shd w:fill="auto" w:val="clear"/>
-                <w:vertAlign w:val="baseline"/>
               </w:rPr>
               <w:t>Desglose funcional del trabajo</w:t>
               <w:tab/>
@@ -1053,54 +652,17 @@
         </w:p>
         <w:p>
           <w:pPr>
-            <w:pStyle w:val="normal1"/>
-            <w:widowControl w:val="false"/>
+            <w:pStyle w:val="TOC2"/>
             <w:tabs>
-              <w:tab w:val="clear" w:pos="720"/>
-              <w:tab w:val="right" w:pos="12000" w:leader="dot"/>
+              <w:tab w:val="clear" w:pos="8743"/>
+              <w:tab w:val="right" w:pos="9025" w:leader="dot"/>
             </w:tabs>
-            <w:spacing w:lineRule="auto" w:line="240" w:before="60" w:after="0"/>
-            <w:ind w:hanging="0" w:start="360"/>
-            <w:rPr>
-              <w:rFonts w:ascii="Arial" w:hAnsi="Arial" w:eastAsia="Arial" w:cs="Arial"/>
-              <w:b w:val="false"/>
-              <w:bCs w:val="false"/>
-              <w:i w:val="false"/>
-              <w:iCs w:val="false"/>
-              <w:caps w:val="false"/>
-              <w:smallCaps w:val="false"/>
-              <w:strike w:val="false"/>
-              <w:dstrike w:val="false"/>
-              <w:color w:val="000000"/>
-              <w:position w:val="0"/>
-              <w:sz w:val="22"/>
-              <w:szCs w:val="22"/>
-              <w:u w:val="none"/>
-              <w:shd w:fill="auto" w:val="clear"/>
-              <w:vertAlign w:val="baseline"/>
-            </w:rPr>
+            <w:rPr/>
           </w:pPr>
-          <w:hyperlink w:anchor="_heading=h.wkenmd9ysm6o">
+          <w:hyperlink w:anchor="__RefHeading___Toc560_4166569315" w:tooltip="Cronograma de trabajo">
             <w:r>
               <w:rPr>
                 <w:rStyle w:val="IndexLink"/>
-                <w:rFonts w:eastAsia="Arial" w:cs="Arial"/>
-                <w:b w:val="false"/>
-                <w:bCs w:val="false"/>
-                <w:i w:val="false"/>
-                <w:iCs w:val="false"/>
-                <w:caps w:val="false"/>
-                <w:smallCaps w:val="false"/>
-                <w:strike w:val="false"/>
-                <w:dstrike w:val="false"/>
-                <w:webHidden/>
-                <w:color w:val="000000"/>
-                <w:position w:val="0"/>
-                <w:sz w:val="22"/>
-                <w:szCs w:val="22"/>
-                <w:u w:val="none"/>
-                <w:shd w:fill="auto" w:val="clear"/>
-                <w:vertAlign w:val="baseline"/>
               </w:rPr>
               <w:t>Cronograma de trabajo</w:t>
               <w:tab/>
@@ -1110,53 +672,17 @@
         </w:p>
         <w:p>
           <w:pPr>
-            <w:pStyle w:val="normal1"/>
-            <w:widowControl w:val="false"/>
+            <w:pStyle w:val="TOC1"/>
             <w:tabs>
-              <w:tab w:val="clear" w:pos="720"/>
-              <w:tab w:val="right" w:pos="12000" w:leader="dot"/>
+              <w:tab w:val="clear" w:pos="9026"/>
+              <w:tab w:val="right" w:pos="9025" w:leader="dot"/>
             </w:tabs>
-            <w:spacing w:lineRule="auto" w:line="240" w:before="60" w:after="0"/>
-            <w:rPr>
-              <w:rFonts w:ascii="Arial" w:hAnsi="Arial" w:eastAsia="Arial" w:cs="Arial"/>
-              <w:b/>
-              <w:bCs/>
-              <w:i w:val="false"/>
-              <w:iCs w:val="false"/>
-              <w:caps w:val="false"/>
-              <w:smallCaps w:val="false"/>
-              <w:strike w:val="false"/>
-              <w:dstrike w:val="false"/>
-              <w:color w:val="000000"/>
-              <w:position w:val="0"/>
-              <w:sz w:val="22"/>
-              <w:szCs w:val="22"/>
-              <w:u w:val="none"/>
-              <w:shd w:fill="auto" w:val="clear"/>
-              <w:vertAlign w:val="baseline"/>
-            </w:rPr>
+            <w:rPr/>
           </w:pPr>
-          <w:hyperlink w:anchor="_heading=h.m1vz6a1on14e">
+          <w:hyperlink w:anchor="__RefHeading___Toc552_4166569315" w:tooltip="Capítulo 4 Conclusiones">
             <w:r>
               <w:rPr>
                 <w:rStyle w:val="IndexLink"/>
-                <w:rFonts w:eastAsia="Arial" w:cs="Arial"/>
-                <w:b/>
-                <w:bCs/>
-                <w:i w:val="false"/>
-                <w:iCs w:val="false"/>
-                <w:caps w:val="false"/>
-                <w:smallCaps w:val="false"/>
-                <w:strike w:val="false"/>
-                <w:dstrike w:val="false"/>
-                <w:webHidden/>
-                <w:color w:val="000000"/>
-                <w:position w:val="0"/>
-                <w:sz w:val="22"/>
-                <w:szCs w:val="22"/>
-                <w:u w:val="none"/>
-                <w:shd w:fill="auto" w:val="clear"/>
-                <w:vertAlign w:val="baseline"/>
               </w:rPr>
               <w:t>Capítulo 4 Conclusiones</w:t>
               <w:tab/>
@@ -1166,53 +692,17 @@
         </w:p>
         <w:p>
           <w:pPr>
-            <w:pStyle w:val="normal1"/>
-            <w:widowControl w:val="false"/>
+            <w:pStyle w:val="TOC1"/>
             <w:tabs>
-              <w:tab w:val="clear" w:pos="720"/>
-              <w:tab w:val="right" w:pos="12000" w:leader="dot"/>
+              <w:tab w:val="clear" w:pos="9026"/>
+              <w:tab w:val="right" w:pos="9025" w:leader="dot"/>
             </w:tabs>
-            <w:spacing w:lineRule="auto" w:line="240" w:before="60" w:after="0"/>
-            <w:rPr>
-              <w:rFonts w:ascii="Arial" w:hAnsi="Arial" w:eastAsia="Arial" w:cs="Arial"/>
-              <w:b/>
-              <w:bCs/>
-              <w:i w:val="false"/>
-              <w:iCs w:val="false"/>
-              <w:caps w:val="false"/>
-              <w:smallCaps w:val="false"/>
-              <w:strike w:val="false"/>
-              <w:dstrike w:val="false"/>
-              <w:color w:val="000000"/>
-              <w:position w:val="0"/>
-              <w:sz w:val="22"/>
-              <w:szCs w:val="22"/>
-              <w:u w:val="none"/>
-              <w:shd w:fill="auto" w:val="clear"/>
-              <w:vertAlign w:val="baseline"/>
-            </w:rPr>
+            <w:rPr/>
           </w:pPr>
-          <w:hyperlink w:anchor="_heading=h.ksblyr6lbso6">
+          <w:hyperlink w:anchor="__RefHeading___Toc550_4166569315" w:tooltip="Lista de Referencias">
             <w:r>
               <w:rPr>
                 <w:rStyle w:val="IndexLink"/>
-                <w:rFonts w:eastAsia="Arial" w:cs="Arial"/>
-                <w:b/>
-                <w:bCs/>
-                <w:i w:val="false"/>
-                <w:iCs w:val="false"/>
-                <w:caps w:val="false"/>
-                <w:smallCaps w:val="false"/>
-                <w:strike w:val="false"/>
-                <w:dstrike w:val="false"/>
-                <w:webHidden/>
-                <w:color w:val="000000"/>
-                <w:position w:val="0"/>
-                <w:sz w:val="22"/>
-                <w:szCs w:val="22"/>
-                <w:u w:val="none"/>
-                <w:shd w:fill="auto" w:val="clear"/>
-                <w:vertAlign w:val="baseline"/>
               </w:rPr>
               <w:t>Lista de Referencias</w:t>
               <w:tab/>
@@ -1222,22 +712,6 @@
           <w:r>
             <w:rPr>
               <w:rStyle w:val="IndexLink"/>
-              <w:rFonts w:eastAsia="Arial" w:cs="Arial"/>
-              <w:b/>
-              <w:bCs/>
-              <w:i w:val="false"/>
-              <w:iCs w:val="false"/>
-              <w:caps w:val="false"/>
-              <w:smallCaps w:val="false"/>
-              <w:strike w:val="false"/>
-              <w:dstrike w:val="false"/>
-              <w:color w:val="000000"/>
-              <w:position w:val="0"/>
-              <w:sz w:val="22"/>
-              <w:szCs w:val="22"/>
-              <w:u w:val="none"/>
-              <w:shd w:fill="auto" w:val="clear"/>
-              <w:vertAlign w:val="baseline"/>
             </w:rPr>
             <w:fldChar w:fldCharType="end"/>
           </w:r>
@@ -1364,8 +838,10 @@
         <w:pStyle w:val="Heading1"/>
         <w:rPr/>
       </w:pPr>
-      <w:bookmarkStart w:id="0" w:name="_heading=h.624hrs1h4ct3"/>
+      <w:bookmarkStart w:id="0" w:name="__RefHeading___Toc548_4166569315"/>
+      <w:bookmarkStart w:id="1" w:name="_heading=h.624hrs1h4ct3"/>
       <w:bookmarkEnd w:id="0"/>
+      <w:bookmarkEnd w:id="1"/>
       <w:r>
         <w:rPr/>
         <w:t>Capítulo 1 Análisis del Problema</w:t>
@@ -1376,8 +852,10 @@
         <w:pStyle w:val="Heading2"/>
         <w:rPr/>
       </w:pPr>
-      <w:bookmarkStart w:id="1" w:name="_heading=h.lehb982uduij"/>
-      <w:bookmarkEnd w:id="1"/>
+      <w:bookmarkStart w:id="2" w:name="__RefHeading___Toc558_4166569315"/>
+      <w:bookmarkStart w:id="3" w:name="_heading=h.lehb982uduij"/>
+      <w:bookmarkEnd w:id="2"/>
+      <w:bookmarkEnd w:id="3"/>
       <w:r>
         <w:rPr>
           <w:b/>
@@ -1425,8 +903,10 @@
           <w:szCs w:val="22"/>
         </w:rPr>
       </w:pPr>
-      <w:bookmarkStart w:id="2" w:name="_heading=h.xkq3qn30dt6p"/>
-      <w:bookmarkEnd w:id="2"/>
+      <w:bookmarkStart w:id="4" w:name="__RefHeading___Toc572_4166569315"/>
+      <w:bookmarkStart w:id="5" w:name="_heading=h.xkq3qn30dt6p"/>
+      <w:bookmarkEnd w:id="4"/>
+      <w:bookmarkEnd w:id="5"/>
       <w:r>
         <w:rPr>
           <w:b/>
@@ -1442,8 +922,8 @@
         <w:pStyle w:val="Heading3"/>
         <w:rPr/>
       </w:pPr>
-      <w:bookmarkStart w:id="3" w:name="_heading=h.hknufj1ma5uw"/>
-      <w:bookmarkEnd w:id="3"/>
+      <w:bookmarkStart w:id="6" w:name="_heading=h.hknufj1ma5uw"/>
+      <w:bookmarkEnd w:id="6"/>
       <w:r>
         <w:rPr/>
         <w:t>Diagramas de flujo de datos</w:t>
@@ -1497,8 +977,8 @@
         <w:pStyle w:val="Heading3"/>
         <w:rPr/>
       </w:pPr>
-      <w:bookmarkStart w:id="4" w:name="_heading=h.ze7704ctd8yz"/>
-      <w:bookmarkEnd w:id="4"/>
+      <w:bookmarkStart w:id="7" w:name="_heading=h.ze7704ctd8yz"/>
+      <w:bookmarkEnd w:id="7"/>
       <w:r>
         <w:rPr/>
         <w:t>Casos de Uso</w:t>
@@ -1528,9 +1008,9 @@
       <w:r>
         <w:rPr/>
       </w:r>
-      <w:bookmarkStart w:id="5" w:name="_heading=h.p0nrlso9vu8d"/>
-      <w:bookmarkStart w:id="6" w:name="_heading=h.p0nrlso9vu8d"/>
-      <w:bookmarkEnd w:id="6"/>
+      <w:bookmarkStart w:id="8" w:name="_heading=h.p0nrlso9vu8d"/>
+      <w:bookmarkStart w:id="9" w:name="_heading=h.p0nrlso9vu8d"/>
+      <w:bookmarkEnd w:id="9"/>
       <w:r>
         <w:br w:type="page"/>
       </w:r>
@@ -1545,8 +1025,10 @@
           <w:szCs w:val="22"/>
         </w:rPr>
       </w:pPr>
-      <w:bookmarkStart w:id="7" w:name="_heading=h.y47pa64web59"/>
-      <w:bookmarkEnd w:id="7"/>
+      <w:bookmarkStart w:id="10" w:name="__RefHeading___Toc556_4166569315"/>
+      <w:bookmarkStart w:id="11" w:name="_heading=h.y47pa64web59"/>
+      <w:bookmarkEnd w:id="10"/>
+      <w:bookmarkEnd w:id="11"/>
       <w:r>
         <w:rPr/>
         <w:t>Capítulo 2 Diseño de la Solución</w:t>
@@ -1557,8 +1039,10 @@
         <w:pStyle w:val="Heading2"/>
         <w:rPr/>
       </w:pPr>
-      <w:bookmarkStart w:id="8" w:name="_heading=h.xuoeeww0ejuk"/>
-      <w:bookmarkEnd w:id="8"/>
+      <w:bookmarkStart w:id="12" w:name="__RefHeading___Toc570_4166569315"/>
+      <w:bookmarkStart w:id="13" w:name="_heading=h.xuoeeww0ejuk"/>
+      <w:bookmarkEnd w:id="12"/>
+      <w:bookmarkEnd w:id="13"/>
       <w:r>
         <w:rPr>
           <w:b/>
@@ -1601,8 +1085,10 @@
         <w:pStyle w:val="Heading2"/>
         <w:rPr/>
       </w:pPr>
-      <w:bookmarkStart w:id="9" w:name="_heading=h.5zvd6ce41c5g"/>
-      <w:bookmarkEnd w:id="9"/>
+      <w:bookmarkStart w:id="14" w:name="__RefHeading___Toc568_4166569315"/>
+      <w:bookmarkStart w:id="15" w:name="_heading=h.5zvd6ce41c5g"/>
+      <w:bookmarkEnd w:id="14"/>
+      <w:bookmarkEnd w:id="15"/>
       <w:r>
         <w:rPr>
           <w:b/>
@@ -1663,8 +1149,10 @@
         <w:pStyle w:val="Heading1"/>
         <w:rPr/>
       </w:pPr>
-      <w:bookmarkStart w:id="10" w:name="_heading=h.ok6b3wy6o8k8"/>
-      <w:bookmarkEnd w:id="10"/>
+      <w:bookmarkStart w:id="16" w:name="__RefHeading___Toc554_4166569315"/>
+      <w:bookmarkStart w:id="17" w:name="_heading=h.ok6b3wy6o8k8"/>
+      <w:bookmarkEnd w:id="16"/>
+      <w:bookmarkEnd w:id="17"/>
       <w:r>
         <w:rPr/>
         <w:t>Capítulo 3 Gestión de Proyecto</w:t>
@@ -1675,8 +1163,10 @@
         <w:pStyle w:val="Heading2"/>
         <w:rPr/>
       </w:pPr>
-      <w:bookmarkStart w:id="11" w:name="_heading=h.8tnt7c5za8ar"/>
-      <w:bookmarkEnd w:id="11"/>
+      <w:bookmarkStart w:id="18" w:name="__RefHeading___Toc566_4166569315"/>
+      <w:bookmarkStart w:id="19" w:name="_heading=h.8tnt7c5za8ar"/>
+      <w:bookmarkEnd w:id="18"/>
+      <w:bookmarkEnd w:id="19"/>
       <w:r>
         <w:rPr>
           <w:b/>
@@ -1719,8 +1209,10 @@
         <w:pStyle w:val="Heading2"/>
         <w:rPr/>
       </w:pPr>
-      <w:bookmarkStart w:id="12" w:name="_heading=h.t3o68wmncyut"/>
-      <w:bookmarkEnd w:id="12"/>
+      <w:bookmarkStart w:id="20" w:name="__RefHeading___Toc564_4166569315"/>
+      <w:bookmarkStart w:id="21" w:name="_heading=h.t3o68wmncyut"/>
+      <w:bookmarkEnd w:id="20"/>
+      <w:bookmarkEnd w:id="21"/>
       <w:r>
         <w:rPr>
           <w:b/>
@@ -1763,8 +1255,10 @@
         <w:pStyle w:val="Heading2"/>
         <w:rPr/>
       </w:pPr>
-      <w:bookmarkStart w:id="13" w:name="_heading=h.gokhxcei9oq"/>
-      <w:bookmarkEnd w:id="13"/>
+      <w:bookmarkStart w:id="22" w:name="__RefHeading___Toc562_4166569315"/>
+      <w:bookmarkStart w:id="23" w:name="_heading=h.gokhxcei9oq"/>
+      <w:bookmarkEnd w:id="22"/>
+      <w:bookmarkEnd w:id="23"/>
       <w:r>
         <w:rPr>
           <w:b/>
@@ -1825,8 +1319,10 @@
           <w:bCs/>
         </w:rPr>
       </w:pPr>
-      <w:bookmarkStart w:id="14" w:name="_heading=h.wkenmd9ysm6o"/>
-      <w:bookmarkEnd w:id="14"/>
+      <w:bookmarkStart w:id="24" w:name="__RefHeading___Toc560_4166569315"/>
+      <w:bookmarkStart w:id="25" w:name="_heading=h.wkenmd9ysm6o"/>
+      <w:bookmarkEnd w:id="24"/>
+      <w:bookmarkEnd w:id="25"/>
       <w:r>
         <w:rPr>
           <w:b/>
@@ -1856,9 +1352,9 @@
       <w:r>
         <w:rPr/>
       </w:r>
-      <w:bookmarkStart w:id="15" w:name="_heading=h.excyh5llms1u"/>
-      <w:bookmarkStart w:id="16" w:name="_heading=h.excyh5llms1u"/>
-      <w:bookmarkEnd w:id="16"/>
+      <w:bookmarkStart w:id="26" w:name="_heading=h.excyh5llms1u"/>
+      <w:bookmarkStart w:id="27" w:name="_heading=h.excyh5llms1u"/>
+      <w:bookmarkEnd w:id="27"/>
       <w:r>
         <w:br w:type="page"/>
       </w:r>
@@ -1873,8 +1369,10 @@
           <w:szCs w:val="22"/>
         </w:rPr>
       </w:pPr>
-      <w:bookmarkStart w:id="17" w:name="_heading=h.m1vz6a1on14e"/>
-      <w:bookmarkEnd w:id="17"/>
+      <w:bookmarkStart w:id="28" w:name="__RefHeading___Toc552_4166569315"/>
+      <w:bookmarkStart w:id="29" w:name="_heading=h.m1vz6a1on14e"/>
+      <w:bookmarkEnd w:id="28"/>
+      <w:bookmarkEnd w:id="29"/>
       <w:r>
         <w:rPr/>
         <w:t>Capítulo 4 Conclusiones</w:t>
@@ -1916,9 +1414,9 @@
       <w:r>
         <w:rPr/>
       </w:r>
-      <w:bookmarkStart w:id="18" w:name="_heading=h.kpz8vjbxyvek"/>
-      <w:bookmarkStart w:id="19" w:name="_heading=h.kpz8vjbxyvek"/>
-      <w:bookmarkEnd w:id="19"/>
+      <w:bookmarkStart w:id="30" w:name="_heading=h.kpz8vjbxyvek"/>
+      <w:bookmarkStart w:id="31" w:name="_heading=h.kpz8vjbxyvek"/>
+      <w:bookmarkEnd w:id="31"/>
       <w:r>
         <w:br w:type="page"/>
       </w:r>
@@ -1928,8 +1426,10 @@
         <w:pStyle w:val="Heading1"/>
         <w:rPr/>
       </w:pPr>
-      <w:bookmarkStart w:id="20" w:name="_heading=h.ksblyr6lbso6"/>
-      <w:bookmarkEnd w:id="20"/>
+      <w:bookmarkStart w:id="32" w:name="__RefHeading___Toc550_4166569315"/>
+      <w:bookmarkStart w:id="33" w:name="_heading=h.ksblyr6lbso6"/>
+      <w:bookmarkEnd w:id="32"/>
+      <w:bookmarkEnd w:id="33"/>
       <w:r>
         <w:rPr/>
         <w:t>Lista de Referencias</w:t>
@@ -2492,6 +1992,30 @@
     <w:name w:val="footer"/>
     <w:basedOn w:val="HeaderandFooter"/>
     <w:pPr/>
+    <w:rPr/>
+  </w:style>
+  <w:style w:type="paragraph" w:styleId="TOC1">
+    <w:name w:val="toc 1"/>
+    <w:basedOn w:val="Index"/>
+    <w:pPr>
+      <w:tabs>
+        <w:tab w:val="clear" w:pos="720"/>
+        <w:tab w:val="right" w:pos="9026" w:leader="dot"/>
+      </w:tabs>
+      <w:ind w:hanging="0" w:start="0"/>
+    </w:pPr>
+    <w:rPr/>
+  </w:style>
+  <w:style w:type="paragraph" w:styleId="TOC2">
+    <w:name w:val="toc 2"/>
+    <w:basedOn w:val="Index"/>
+    <w:pPr>
+      <w:tabs>
+        <w:tab w:val="clear" w:pos="720"/>
+        <w:tab w:val="right" w:pos="8743" w:leader="dot"/>
+      </w:tabs>
+      <w:ind w:hanging="0" w:start="283"/>
+    </w:pPr>
     <w:rPr/>
   </w:style>
   <w:style w:type="table" w:default="1" w:styleId="TableNormal">

</xml_diff>